<commit_message>
Illustrate the walkthrough's canvass and freeze-replacement additions
The two stages updated in the previous commit were prose-only. Adds the
screenshots already captured for the user manual:

  Figure 8.4   Accounting's approval - the evidence beside each checklist
               line, the supplier checks, and the three-quotation canvass
  Figure 11.3  Replacing a damaged item inside the material freeze

The document's generator did not survive its session, so the media file,
the relationship, and the drawing XML are written directly, continuing the
numbering already in the package rather than assuming it. Both are scaled
to the text width the other 43 figures use, and the aspect ratio is taken
from each PNG's own header so neither is stretched.

71 pages, 45 figures.

Co-Authored-By: Claude <noreply@anthropic.com>
</commit_message>
<xml_diff>
--- a/docs/FinalWalkthrough.docx
+++ b/docs/FinalWalkthrough.docx
@@ -12471,6 +12471,67 @@
     </w:p>
     <w:p>
       <w:pPr>
+        <w:keepNext/>
+        <w:spacing w:before="280" w:after="80"/>
+        <w:jc w:val="center"/>
+      </w:pPr>
+      <w:r>
+        <w:rPr>
+          <w:noProof/>
+        </w:rPr>
+        <w:drawing>
+          <wp:inline distT="0" distB="0" distL="0" distR="0">
+            <wp:extent cx="5943600" cy="6977270"/>
+            <wp:effectExtent l="0" t="0" r="0" b="0"/>
+            <wp:docPr id="44" name="image44.png"/>
+            <wp:cNvGraphicFramePr>
+              <a:graphicFrameLocks xmlns:a="http://schemas.openxmlformats.org/drawingml/2006/main" noChangeAspect="1"/>
+            </wp:cNvGraphicFramePr>
+            <a:graphic xmlns:a="http://schemas.openxmlformats.org/drawingml/2006/main">
+              <a:graphicData uri="http://schemas.openxmlformats.org/drawingml/2006/picture">
+                <pic:pic xmlns:pic="http://schemas.openxmlformats.org/drawingml/2006/picture">
+                  <pic:nvPicPr>
+                    <pic:cNvPr id="44" name="image44.png"/>
+                    <pic:cNvPicPr/>
+                  </pic:nvPicPr>
+                  <pic:blipFill>
+                    <a:blip r:embed="rId54"/>
+                    <a:stretch>
+                      <a:fillRect/>
+                    </a:stretch>
+                  </pic:blipFill>
+                  <pic:spPr>
+                    <a:xfrm>
+                      <a:off x="0" y="0"/>
+                      <a:ext cx="5943600" cy="6977270"/>
+                    </a:xfrm>
+                    <a:prstGeom prst="rect">
+                      <a:avLst/>
+                    </a:prstGeom>
+                  </pic:spPr>
+                </pic:pic>
+              </a:graphicData>
+            </a:graphic>
+          </wp:inline>
+        </w:drawing>
+      </w:r>
+    </w:p>
+    <w:p>
+      <w:pPr>
+        <w:spacing w:after="360"/>
+        <w:jc w:val="center"/>
+      </w:pPr>
+      <w:r>
+        <w:rPr>
+          <w:i/>
+          <w:sz w:val="18"/>
+          <w:szCs w:val="18"/>
+        </w:rPr>
+        <w:t>Figure 8.4 Accounting’s approval: the evidence beside each checklist line, the supplier checks, and the three-quotation canvass</w:t>
+      </w:r>
+    </w:p>
+    <w:p>
+      <w:pPr>
         <w:spacing w:before="200" w:after="100" w:line="276" w:lineRule="auto"/>
         <w:ind w:left="360"/>
       </w:pPr>
@@ -15800,6 +15861,67 @@
       </w:r>
       <w:r>
         <w:t xml:space="preserve"> A physical item can break, go missing, or spoil inside the last week, and that is a fact rather than a decision. The freeze locks what the event is owed, not which particular unit satisfies it, so the department can click Report Damage Or Loss &amp;amp; Replace on the item and swap it for an equivalent at the same quantity. An incident is filed automatically, Accounting and Admin are notified, and the replacement returns to pending preparation. Reducing the quantity, or removing the item altogether, is still the thing the freeze prevents and still needs an Admin.</w:t>
+      </w:r>
+    </w:p>
+    <w:p>
+      <w:pPr>
+        <w:keepNext/>
+        <w:spacing w:before="280" w:after="80"/>
+        <w:jc w:val="center"/>
+      </w:pPr>
+      <w:r>
+        <w:rPr>
+          <w:noProof/>
+        </w:rPr>
+        <w:drawing>
+          <wp:inline distT="0" distB="0" distL="0" distR="0">
+            <wp:extent cx="5943600" cy="6143199"/>
+            <wp:effectExtent l="0" t="0" r="0" b="0"/>
+            <wp:docPr id="45" name="image45.png"/>
+            <wp:cNvGraphicFramePr>
+              <a:graphicFrameLocks xmlns:a="http://schemas.openxmlformats.org/drawingml/2006/main" noChangeAspect="1"/>
+            </wp:cNvGraphicFramePr>
+            <a:graphic xmlns:a="http://schemas.openxmlformats.org/drawingml/2006/main">
+              <a:graphicData uri="http://schemas.openxmlformats.org/drawingml/2006/picture">
+                <pic:pic xmlns:pic="http://schemas.openxmlformats.org/drawingml/2006/picture">
+                  <pic:nvPicPr>
+                    <pic:cNvPr id="45" name="image45.png"/>
+                    <pic:cNvPicPr/>
+                  </pic:nvPicPr>
+                  <pic:blipFill>
+                    <a:blip r:embed="rId55"/>
+                    <a:stretch>
+                      <a:fillRect/>
+                    </a:stretch>
+                  </pic:blipFill>
+                  <pic:spPr>
+                    <a:xfrm>
+                      <a:off x="0" y="0"/>
+                      <a:ext cx="5943600" cy="6143199"/>
+                    </a:xfrm>
+                    <a:prstGeom prst="rect">
+                      <a:avLst/>
+                    </a:prstGeom>
+                  </pic:spPr>
+                </pic:pic>
+              </a:graphicData>
+            </a:graphic>
+          </wp:inline>
+        </w:drawing>
+      </w:r>
+    </w:p>
+    <w:p>
+      <w:pPr>
+        <w:spacing w:after="360"/>
+        <w:jc w:val="center"/>
+      </w:pPr>
+      <w:r>
+        <w:rPr>
+          <w:i/>
+          <w:sz w:val="18"/>
+          <w:szCs w:val="18"/>
+        </w:rPr>
+        <w:t>Figure 11.3 Replacing a damaged item inside the material freeze — the quantity cannot change</w:t>
       </w:r>
     </w:p>
     <w:p>

</xml_diff>